<commit_message>
docs: enforce text-only module headers
</commit_message>
<xml_diff>
--- a/web/v2/assets/templates/LEGAVIK_Module1_资产与账户_Canonical_V2.docx
+++ b/web/v2/assets/templates/LEGAVIK_Module1_资产与账户_Canonical_V2.docx
@@ -2050,45 +2050,18 @@
 <w:hdr xmlns:r="http://schemas.openxmlformats.org/officeDocument/2006/relationships" xmlns:wp="http://schemas.openxmlformats.org/drawingml/2006/wordprocessingDrawing" xmlns:w="http://schemas.openxmlformats.org/wordprocessingml/2006/main" xmlns:w10="urn:schemas-microsoft-com:office:word" xmlns:w14="http://schemas.microsoft.com/office/word/2010/wordml" xmlns:wps="http://schemas.microsoft.com/office/word/2010/wordprocessingShape" xmlns:wpg="http://schemas.microsoft.com/office/word/2010/wordprocessingGroup" xmlns:mc="http://schemas.openxmlformats.org/markup-compatibility/2006" xmlns:v="urn:schemas-microsoft-com:vml" xmlns:o="urn:schemas-microsoft-com:office:office" xmlns:m="http://schemas.openxmlformats.org/officeDocument/2006/math" mc:Ignorable="w14">
   <w:p>
     <w:pPr>
-      <w:pStyle w:val="页眉与页脚"/>
-      <w:bidi w:val="0"/>
-      <w:spacing w:after="0"/>
+      <w:spacing w:before="0" w:after="0" w:line="240" w:lineRule="auto"/>
       <w:jc w:val="left"/>
     </w:pPr>
-    <w:r/>
     <w:r>
-      <w:drawing>
-        <wp:inline xmlns:a="http://schemas.openxmlformats.org/drawingml/2006/main" xmlns:pic="http://schemas.openxmlformats.org/drawingml/2006/picture">
-          <wp:extent cx="1234440" cy="411480"/>
-          <wp:docPr id="1" name="Picture 1"/>
-          <wp:cNvGraphicFramePr>
-            <a:graphicFrameLocks noChangeAspect="1"/>
-          </wp:cNvGraphicFramePr>
-          <a:graphic>
-            <a:graphicData uri="http://schemas.openxmlformats.org/drawingml/2006/picture">
-              <pic:pic>
-                <pic:nvPicPr>
-                  <pic:cNvPr id="0" name="legavik-brand-master-v1.png"/>
-                  <pic:cNvPicPr/>
-                </pic:nvPicPr>
-                <pic:blipFill>
-                  <a:blip r:embed="rId1"/>
-                  <a:stretch>
-                    <a:fillRect/>
-                  </a:stretch>
-                </pic:blipFill>
-                <pic:spPr>
-                  <a:xfrm>
-                    <a:off x="0" y="0"/>
-                    <a:ext cx="1234440" cy="411480"/>
-                  </a:xfrm>
-                  <a:prstGeom prst="rect"/>
-                </pic:spPr>
-              </pic:pic>
-            </a:graphicData>
-          </a:graphic>
-        </wp:inline>
-      </w:drawing>
+      <w:rPr>
+        <w:rFonts w:ascii="Arial" w:hAnsi="Arial" w:eastAsia="Arial"/>
+        <w:b/>
+        <w:color w:val="0B4F3C"/>
+        <w:sz w:val="18"/>
+        <w:noProof/>
+      </w:rPr>
+      <w:t>LEGAVIK · Recovery Map</w:t>
     </w:r>
   </w:p>
 </w:hdr>

</xml_diff>

<commit_message>
docs: pilot legacy Module 1 brand line
</commit_message>
<xml_diff>
--- a/web/v2/assets/templates/LEGAVIK_Module1_资产与账户_Canonical_V2.docx
+++ b/web/v2/assets/templates/LEGAVIK_Module1_资产与账户_Canonical_V2.docx
@@ -13,9 +13,8 @@
           <w:color w:val="5e6b67"/>
           <w:sz w:val="19"/>
           <w:szCs w:val="19"/>
-          <w:u w:color="1f6b52"/>
           <w:rtl w:val="0"/>
-          <w:lang w:val="de-DE"/>
+          <w:lang w:val="zxx" w:eastAsia="zxx" w:bidi="zxx"/>
         </w:rPr>
         <w:t xml:space="preserve">LEGAVIK </w:t>
       </w:r>
@@ -2048,22 +2047,7 @@
 
 <file path=word/header1.xml><?xml version="1.0" encoding="utf-8"?>
 <w:hdr xmlns:r="http://schemas.openxmlformats.org/officeDocument/2006/relationships" xmlns:wp="http://schemas.openxmlformats.org/drawingml/2006/wordprocessingDrawing" xmlns:w="http://schemas.openxmlformats.org/wordprocessingml/2006/main" xmlns:w10="urn:schemas-microsoft-com:office:word" xmlns:w14="http://schemas.microsoft.com/office/word/2010/wordml" xmlns:wps="http://schemas.microsoft.com/office/word/2010/wordprocessingShape" xmlns:wpg="http://schemas.microsoft.com/office/word/2010/wordprocessingGroup" xmlns:mc="http://schemas.openxmlformats.org/markup-compatibility/2006" xmlns:v="urn:schemas-microsoft-com:vml" xmlns:o="urn:schemas-microsoft-com:office:office" xmlns:m="http://schemas.openxmlformats.org/officeDocument/2006/math" mc:Ignorable="w14">
-  <w:p>
-    <w:pPr>
-      <w:spacing w:before="0" w:after="0" w:line="240" w:lineRule="auto"/>
-      <w:jc w:val="left"/>
-    </w:pPr>
-    <w:r>
-      <w:rPr>
-        <w:rFonts w:ascii="Arial" w:hAnsi="Arial" w:eastAsia="Arial"/>
-        <w:b/>
-        <w:color w:val="0B4F3C"/>
-        <w:sz w:val="18"/>
-        <w:noProof/>
-      </w:rPr>
-      <w:t>LEGAVIK · Recovery Map</w:t>
-    </w:r>
-  </w:p>
+  <w:p/>
 </w:hdr>
 </file>
 

</xml_diff>